<commit_message>
Site : audit des résumés et dépliants (corrections du 20/10/2026)
Co-Authored-By: Claude Sonnet 5.5 <noreply@anthropic.com>
Claude-Session: https://claude.ai/code/session_01Qy2Wa5ACXajAV16uhKD7cK
</commit_message>
<xml_diff>
--- a/resumes/att-non-cadres-2020.docx
+++ b/resumes/att-non-cadres-2020.docx
@@ -46,7 +46,7 @@
           <w:b/>
           <w:i w:val="0"/>
         </w:rPr>
-        <w:t>Source : accord du 14 septembre 2020, tel que modifié par l'Avenant n°1 du 31 janvier 2022 (heures supplémentaires) et par l'avenant du 31 décembre 2025 (congés payés pendant un arrêt maladie). Le reste de l'accord de 2020 est inchangé.</w:t>
+        <w:t>Source : accord du 14 septembre 2020, avenant n°1 du 31 janvier 2022 (heures supplémentaires) et avenant du 31 décembre 2025 (congés payés pendant un arrêt maladie).</w:t>
       </w:r>
     </w:p>
     <w:p>
@@ -350,7 +350,7 @@
           <w:b/>
           <w:i w:val="0"/>
         </w:rPr>
-        <w:t>Vos heures supplémentaires — version en vigueur (Avenant n°1, 31/01/2022, remplace l'ex-article 2.6)</w:t>
+        <w:t>Vos heures supplémentaires (Avenant n°1, 31/01/2022)</w:t>
       </w:r>
       <w:r>
         <w:rPr>
@@ -592,7 +592,7 @@
           <w:b/>
           <w:i w:val="0"/>
         </w:rPr>
-        <w:t>Si vous tombez malade pendant vos congés (version en vigueur depuis le 31/12/2025)</w:t>
+        <w:t>Si vous tombez malade pendant vos congés (avenant du 31/12/2025)</w:t>
       </w:r>
       <w:r>
         <w:rPr>
@@ -627,22 +627,7 @@
           <w:b w:val="0"/>
           <w:i w:val="0"/>
         </w:rPr>
-        <w:t xml:space="preserve">. </w:t>
-      </w:r>
-      <w:r>
-        <w:rPr>
-          <w:b w:val="0"/>
-          <w:i/>
-          <w:color w:val="5B6578"/>
-        </w:rPr>
-        <w:t>(Ceci remplace la règle d'origine de 2020, qui maintenait le congé sans interruption.)</w:t>
-      </w:r>
-      <w:r>
-        <w:rPr>
-          <w:b w:val="0"/>
-          <w:i w:val="0"/>
-        </w:rPr>
-        <w:t xml:space="preserve"> À votre retour, vous êtes informé(e) du report sur votre bulletin de salaire ou par mail, et vous avez </w:t>
+        <w:t xml:space="preserve">. À votre retour, vous êtes informé(e) du report sur votre bulletin de salaire ou par mail, et vous avez </w:t>
       </w:r>
       <w:r>
         <w:rPr>
@@ -1035,35 +1020,7 @@
           <w:b w:val="0"/>
           <w:i w:val="0"/>
         </w:rPr>
-        <w:t>Aujourd'hui, ce sont les règles de l'</w:t>
-      </w:r>
-      <w:r>
-        <w:rPr>
-          <w:b/>
-          <w:i w:val="0"/>
-        </w:rPr>
-        <w:t>Avenant n°1 du 31 janvier 2022</w:t>
-      </w:r>
-      <w:r>
-        <w:rPr>
-          <w:b w:val="0"/>
-          <w:i w:val="0"/>
-        </w:rPr>
-        <w:t xml:space="preserve"> qui s'appliquent pour vos heures supplémentaires, et celles de l'</w:t>
-      </w:r>
-      <w:r>
-        <w:rPr>
-          <w:b/>
-          <w:i w:val="0"/>
-        </w:rPr>
-        <w:t>avenant du 31 décembre 2025</w:t>
-      </w:r>
-      <w:r>
-        <w:rPr>
-          <w:b w:val="0"/>
-          <w:i w:val="0"/>
-        </w:rPr>
-        <w:t xml:space="preserve"> pour vos congés payés en cas d'arrêt maladie — tout le reste de l'accord de 2020 continue de s'appliquer tel quel. Pour les astreintes et le décès d'un proche pendant vos congés, pensez aussi à consulter les articles correspondants de la CCN des CLCC (respectivement 2.5.4.3 et 2.4.3.3).</w:t>
+        <w:t>Pour les astreintes et le décès d'un proche pendant vos congés, consultez aussi les articles correspondants de la CCN des CLCC (respectivement 2.5.4.3 et 2.4.3.3).</w:t>
       </w:r>
     </w:p>
     <w:p>

</xml_diff>